<commit_message>
Entrega de archivo pdf
</commit_message>
<xml_diff>
--- a/NOTEBOOKS/Actividad Notebook 01 – Introducción a Python.docx
+++ b/NOTEBOOKS/Actividad Notebook 01 – Introducción a Python.docx
@@ -166,7 +166,7 @@
           <w:sz w:val="28"/>
           <w:szCs w:val="20"/>
         </w:rPr>
-        <w:t>(Escribe tu nombre completo aquí)</w:t>
+        <w:t>Jesús De la Fuente Reyes</w:t>
       </w:r>
     </w:p>
     <w:p>
@@ -174,6 +174,8 @@
         <w:spacing w:after="160"/>
         <w:ind w:left="0"/>
         <w:rPr>
+          <w:i/>
+          <w:iCs/>
           <w:sz w:val="28"/>
           <w:szCs w:val="20"/>
         </w:rPr>
@@ -194,15 +196,28 @@
         </w:rPr>
         <w:br/>
       </w:r>
-      <w:r>
-        <w:rPr>
-          <w:i/>
-          <w:iCs/>
-          <w:sz w:val="28"/>
-          <w:szCs w:val="20"/>
-        </w:rPr>
-        <w:t>(Pega aquí el enlace al repositorio público en GitHub)</w:t>
-      </w:r>
+      <w:hyperlink r:id="rId8" w:history="1">
+        <w:r>
+          <w:rPr>
+            <w:rStyle w:val="Hipervnculo"/>
+            <w:i/>
+            <w:iCs/>
+            <w:sz w:val="28"/>
+            <w:szCs w:val="20"/>
+          </w:rPr>
+          <w:t>https://github.com/delafuentereyes/2026C2-G01-FUNDAMENTOS-DE-PYTHO</w:t>
+        </w:r>
+        <w:r>
+          <w:rPr>
+            <w:rStyle w:val="Hipervnculo"/>
+            <w:i/>
+            <w:iCs/>
+            <w:sz w:val="28"/>
+            <w:szCs w:val="20"/>
+          </w:rPr>
+          <w:t>N</w:t>
+        </w:r>
+      </w:hyperlink>
     </w:p>
     <w:p>
       <w:pPr>
@@ -296,7 +311,7 @@
           <w:szCs w:val="18"/>
         </w:rPr>
         <w:pict w14:anchorId="18252A81">
-          <v:rect id="_x0000_i1053" style="width:0;height:1.5pt" o:hralign="center" o:hrstd="t" o:hr="t" fillcolor="#a0a0a0" stroked="f"/>
+          <v:rect id="_x0000_i1027" style="width:0;height:1.5pt" o:hralign="center" o:hrstd="t" o:hr="t" fillcolor="#a0a0a0" stroked="f"/>
         </w:pict>
       </w:r>
     </w:p>
@@ -673,7 +688,7 @@
           <w14:ligatures w14:val="none"/>
         </w:rPr>
         <w:pict w14:anchorId="04B911BC">
-          <v:rect id="_x0000_i1051" style="width:0;height:1.5pt" o:hralign="center" o:hrstd="t" o:hr="t" stroked="f"/>
+          <v:rect id="_x0000_i1028" style="width:0;height:1.5pt" o:hralign="center" o:hrstd="t" o:hr="t" stroked="f"/>
         </w:pict>
       </w:r>
     </w:p>
@@ -817,10 +832,10 @@
       <w:bookmarkEnd w:id="1"/>
     </w:p>
     <w:sectPr>
-      <w:headerReference w:type="even" r:id="rId8"/>
-      <w:headerReference w:type="default" r:id="rId9"/>
-      <w:footerReference w:type="default" r:id="rId10"/>
-      <w:headerReference w:type="first" r:id="rId11"/>
+      <w:headerReference w:type="even" r:id="rId9"/>
+      <w:headerReference w:type="default" r:id="rId10"/>
+      <w:footerReference w:type="default" r:id="rId11"/>
+      <w:headerReference w:type="first" r:id="rId12"/>
       <w:pgSz w:w="11906" w:h="16838" w:code="9"/>
       <w:pgMar w:top="1440" w:right="1080" w:bottom="1440" w:left="1080" w:header="720" w:footer="57" w:gutter="0"/>
       <w:cols w:space="720"/>
@@ -1071,7 +1086,7 @@
 <w:numbering xmlns:wpc="http://schemas.microsoft.com/office/word/2010/wordprocessingCanvas" xmlns:cx="http://schemas.microsoft.com/office/drawing/2014/chartex" xmlns:cx1="http://schemas.microsoft.com/office/drawing/2015/9/8/chartex" xmlns:cx2="http://schemas.microsoft.com/office/drawing/2015/10/21/chartex" xmlns:cx3="http://schemas.microsoft.com/office/drawing/2016/5/9/chartex" xmlns:cx4="http://schemas.microsoft.com/office/drawing/2016/5/10/chartex" xmlns:cx5="http://schemas.microsoft.com/office/drawing/2016/5/11/chartex" xmlns:cx6="http://schemas.microsoft.com/office/drawing/2016/5/12/chartex" xmlns:cx7="http://schemas.microsoft.com/office/drawing/2016/5/13/chartex" xmlns:cx8="http://schemas.microsoft.com/office/drawing/2016/5/14/chartex" xmlns:mc="http://schemas.openxmlformats.org/markup-compatibility/2006" xmlns:aink="http://schemas.microsoft.com/office/drawing/2016/ink" xmlns:am3d="http://schemas.microsoft.com/office/drawing/2017/model3d" xmlns:o="urn:schemas-microsoft-com:office:office" xmlns:oel="http://schemas.microsoft.com/office/2019/extlst" xmlns:r="http://schemas.openxmlformats.org/officeDocument/2006/relationships" xmlns:m="http://schemas.openxmlformats.org/officeDocument/2006/math" xmlns:v="urn:schemas-microsoft-com:vml" xmlns:wp14="http://schemas.microsoft.com/office/word/2010/wordprocessingDrawing" xmlns:wp="http://schemas.openxmlformats.org/drawingml/2006/wordprocessingDrawing" xmlns:w10="urn:schemas-microsoft-com:office:word" xmlns:w="http://schemas.openxmlformats.org/wordprocessingml/2006/main" xmlns:w14="http://schemas.microsoft.com/office/word/2010/wordml" xmlns:w15="http://schemas.microsoft.com/office/word/2012/wordml" xmlns:w16cex="http://schemas.microsoft.com/office/word/2018/wordml/cex" xmlns:w16cid="http://schemas.microsoft.com/office/word/2016/wordml/cid" xmlns:w16="http://schemas.microsoft.com/office/word/2018/wordml" xmlns:w16du="http://schemas.microsoft.com/office/word/2023/wordml/word16du" xmlns:w16sdtdh="http://schemas.microsoft.com/office/word/2020/wordml/sdtdatahash" xmlns:w16sdtfl="http://schemas.microsoft.com/office/word/2024/wordml/sdtformatlock" xmlns:w16se="http://schemas.microsoft.com/office/word/2015/wordml/symex" xmlns:wpg="http://schemas.microsoft.com/office/word/2010/wordprocessingGroup" xmlns:wpi="http://schemas.microsoft.com/office/word/2010/wordprocessingInk" xmlns:wne="http://schemas.microsoft.com/office/word/2006/wordml" xmlns:wps="http://schemas.microsoft.com/office/word/2010/wordprocessingShape" mc:Ignorable="w14 w15 w16se w16cid w16 w16cex w16sdtdh w16sdtfl w16du wp14">
   <w:numPicBullet w:numPicBulletId="0">
     <w:pict>
-      <v:rect id="_x0000_i1026" style="width:0;height:1.5pt" o:bullet="t" o:hrstd="t" o:hr="t" fillcolor="#a0a0a0" stroked="f"/>
+      <v:rect id="_x0000_i1025" style="width:0;height:1.5pt" o:bullet="t" o:hrstd="t" o:hr="t" fillcolor="#a0a0a0" stroked="f"/>
     </w:pict>
   </w:numPicBullet>
   <w:abstractNum w:abstractNumId="0" w15:restartNumberingAfterBreak="0">
@@ -3043,6 +3058,7 @@
   <w:style w:type="character" w:default="1" w:styleId="Fuentedeprrafopredeter">
     <w:name w:val="Default Paragraph Font"/>
     <w:uiPriority w:val="1"/>
+    <w:semiHidden/>
     <w:unhideWhenUsed/>
   </w:style>
   <w:style w:type="table" w:default="1" w:styleId="Tablanormal">
@@ -3286,6 +3302,29 @@
       <w:iCs/>
       <w:color w:val="0F4761" w:themeColor="accent1" w:themeShade="BF"/>
       <w:sz w:val="36"/>
+    </w:rPr>
+  </w:style>
+  <w:style w:type="character" w:styleId="Hipervnculo">
+    <w:name w:val="Hyperlink"/>
+    <w:basedOn w:val="Fuentedeprrafopredeter"/>
+    <w:uiPriority w:val="99"/>
+    <w:unhideWhenUsed/>
+    <w:rsid w:val="00B32908"/>
+    <w:rPr>
+      <w:color w:val="467886" w:themeColor="hyperlink"/>
+      <w:u w:val="single"/>
+    </w:rPr>
+  </w:style>
+  <w:style w:type="character" w:styleId="Mencinsinresolver">
+    <w:name w:val="Unresolved Mention"/>
+    <w:basedOn w:val="Fuentedeprrafopredeter"/>
+    <w:uiPriority w:val="99"/>
+    <w:semiHidden/>
+    <w:unhideWhenUsed/>
+    <w:rsid w:val="00B32908"/>
+    <w:rPr>
+      <w:color w:val="605E5C"/>
+      <w:shd w:val="clear" w:color="auto" w:fill="E1DFDD"/>
     </w:rPr>
   </w:style>
 </w:styles>

</xml_diff>